<commit_message>
fix: prevent navbar overflow on small resolutions
</commit_message>
<xml_diff>
--- a/dist/Nicolas_Schernetzki_CV_Eng.docx
+++ b/dist/Nicolas_Schernetzki_CV_Eng.docx
@@ -29,7 +29,7 @@
           <w:sz w:val="18"/>
           <w:szCs w:val="18"/>
         </w:rPr>
-        <w:t xml:space="preserve">Full-Stack Developer | Back-End Developer</w:t>
+        <w:t xml:space="preserve">Full-Stack Developer</w:t>
       </w:r>
     </w:p>
     <w:p>
@@ -45,7 +45,7 @@
         </w:rPr>
         <w:t xml:space="preserve">Ituzaingó, Buenos Aires  •  +54 11 6101-4743  •  ngsrepresentaciones@gmail.com  •  </w:t>
       </w:r>
-      <w:hyperlink w:history="1" r:id="rId-wcqejlusxiy63_3ws1ko">
+      <w:hyperlink w:history="1" r:id="rIdyqow-a5vqcgf2qjsc26rp">
         <w:r>
           <w:rPr>
             <w:rFonts w:ascii="Calibri" w:cs="Calibri" w:eastAsia="Calibri" w:hAnsi="Calibri"/>
@@ -66,7 +66,7 @@
         </w:rPr>
         <w:t xml:space="preserve">  •  </w:t>
       </w:r>
-      <w:hyperlink w:history="1" r:id="rIdfqrmdogxna-0odj_zj3xp">
+      <w:hyperlink w:history="1" r:id="rIdyxvgbkwi0u6hzp7pkruwp">
         <w:r>
           <w:rPr>
             <w:rFonts w:ascii="Calibri" w:cs="Calibri" w:eastAsia="Calibri" w:hAnsi="Calibri"/>
@@ -87,7 +87,7 @@
         </w:rPr>
         <w:t xml:space="preserve">  •  </w:t>
       </w:r>
-      <w:hyperlink w:history="1" r:id="rId5de2x2sktpgjsitt4qz-4">
+      <w:hyperlink w:history="1" r:id="rId3tovikbt4cn44knzzkxer">
         <w:r>
           <w:rPr>
             <w:rFonts w:ascii="Calibri" w:cs="Calibri" w:eastAsia="Calibri" w:hAnsi="Calibri"/>
@@ -165,15 +165,15 @@
           <w:sz w:val="18"/>
           <w:szCs w:val="18"/>
         </w:rPr>
-        <w:t xml:space="preserve">Languages: </w:t>
-      </w:r>
-      <w:r>
-        <w:rPr>
-          <w:rFonts w:ascii="Calibri" w:cs="Calibri" w:eastAsia="Calibri" w:hAnsi="Calibri"/>
-          <w:sz w:val="18"/>
-          <w:szCs w:val="18"/>
-        </w:rPr>
-        <w:t xml:space="preserve">JavaScript, Java, Python, C#, C++, Visual Basic</w:t>
+        <w:t xml:space="preserve">Programming Languages: </w:t>
+      </w:r>
+      <w:r>
+        <w:rPr>
+          <w:rFonts w:ascii="Calibri" w:cs="Calibri" w:eastAsia="Calibri" w:hAnsi="Calibri"/>
+          <w:sz w:val="18"/>
+          <w:szCs w:val="18"/>
+        </w:rPr>
+        <w:t xml:space="preserve">JavaScript, Python, C#, C++, Java, Visual Basic</w:t>
       </w:r>
     </w:p>
     <w:p>
@@ -311,7 +311,7 @@
           <w:sz w:val="18"/>
           <w:szCs w:val="18"/>
         </w:rPr>
-        <w:t xml:space="preserve">Git, Docker, Visual Studio, VS Code, Microsoft Office</w:t>
+        <w:t xml:space="preserve">Git, Visual Studio, VS Code, Postman, Microsoft Office</w:t>
       </w:r>
     </w:p>
     <w:p>
@@ -403,7 +403,7 @@
         </w:rPr>
         <w:t xml:space="preserve">  |  </w:t>
       </w:r>
-      <w:hyperlink w:history="1" r:id="rIdnbpbxjmbie6pe1kn2iwj1">
+      <w:hyperlink w:history="1" r:id="rIdtybdm9qo35-ifppmykksu">
         <w:r>
           <w:rPr>
             <w:rFonts w:ascii="Calibri" w:cs="Calibri" w:eastAsia="Calibri" w:hAnsi="Calibri"/>
@@ -424,7 +424,7 @@
         </w:rPr>
         <w:t xml:space="preserve">  |  </w:t>
       </w:r>
-      <w:hyperlink w:history="1" r:id="rIdojrc0byjwqif4mp_ghqkl">
+      <w:hyperlink w:history="1" r:id="rIdm1qcutctfzg_tjs_2psgl">
         <w:r>
           <w:rPr>
             <w:rFonts w:ascii="Calibri" w:cs="Calibri" w:eastAsia="Calibri" w:hAnsi="Calibri"/>
@@ -517,7 +517,7 @@
         </w:rPr>
         <w:t xml:space="preserve">  |  </w:t>
       </w:r>
-      <w:hyperlink w:history="1" r:id="rId_5_e5dnk_jmqxhpl4zhhp">
+      <w:hyperlink w:history="1" r:id="rIdadge2llycfn4ird47sjt4">
         <w:r>
           <w:rPr>
             <w:rFonts w:ascii="Calibri" w:cs="Calibri" w:eastAsia="Calibri" w:hAnsi="Calibri"/>
@@ -538,7 +538,7 @@
         </w:rPr>
         <w:t xml:space="preserve">  |  </w:t>
       </w:r>
-      <w:hyperlink w:history="1" r:id="rIdxrsm4fukn_1vooz1w1efw">
+      <w:hyperlink w:history="1" r:id="rIdexdx3u7e16tpvprcvfybl">
         <w:r>
           <w:rPr>
             <w:rFonts w:ascii="Calibri" w:cs="Calibri" w:eastAsia="Calibri" w:hAnsi="Calibri"/>

</xml_diff>